<commit_message>
content: retitle the sibling article to "A decade in the rankings"
Drops the ", told straight." tail from the headline. The `emphasis`
frontmatter pointed at "told straight", which no longer occurs in the
title, so the hero would have rendered with no italic accent at all;
repointed it at "decade" to keep the headline treatment the other
article has.

Slug is unchanged, so /articles/rankings-decade-told-straight and every
existing link to it still resolve.

Also refreshes the editorial manifest and review docx: block B-001 is the
only one whose text changed, the other 244 blocks in that file are pure
byte-offset shifts from the shorter frontmatter.

Verified: typecheck clean, build clean (9 pages), claims-audit OK,
verify-extract all PASS, dom-checks unchanged (the one pre-existing
em-dash failure is in the other article's BumpChart).

Co-Authored-By: Claude Opus 5 <noreply@anthropic.com>
Claude-Session: https://claude.ai/code/session_018kZUa2DSMd6VEEtmLBJ8HK
</commit_message>
<xml_diff>
--- a/editorial/the-index-editorial-review.docx
+++ b/editorial/the-index-editorial-review.docx
@@ -13144,7 +13144,7 @@
           <w:sz w:val="40"/>
           <w:szCs w:val="40"/>
         </w:rPr>
-        <w:t xml:space="preserve">A decade in the rankings, told straight</w:t>
+        <w:t xml:space="preserve">A decade in the rankings</w:t>
       </w:r>
     </w:p>
     <w:p>
@@ -13224,7 +13224,7 @@
           <w:sz w:val="22"/>
           <w:szCs w:val="22"/>
         </w:rPr>
-        <w:t xml:space="preserve">A decade in the rankings, told straight.</w:t>
+        <w:t xml:space="preserve">A decade in the rankings</w:t>
       </w:r>
     </w:p>
     <w:p>

</xml_diff>